<commit_message>
fix: NIP enregistre (unique), cloture et modification d'un dossier, retrait d'une personne d'un dossier
Constats : le serveur ignorait le NIP saisi ; la cloture d'un dossier appelait une adresse inexistante ; le retrait d'une personne d'un dossier aussi.
- V11 : NIP (17 caracteres, unique) ; normalisation, refus des doublons (409, en nommant la personne), GET /personnes/physiques/verifier-nip, recherche avancee et verification par NIP
- PATCH /dossiers/{id}/cloturer (agent, admin) : refuse tant qu'un fait attend une validation ; un dossier cloture n'accepte plus modification, personne, fait ni document (statuts judiciaires et peines restent enregistrables)
- DELETE /dossiers/{id}/implications/{id} (agent, admin) : dossier ouvert, aucun fait valide ni peine, sinon 409 motive
- 87 tests (dont NIP, cloture, retrait) ; documents Word et guides mis a jour (v11)

Co-Authored-By: Claude Sonnet 5.5 <noreply@anthropic.com>
</commit_message>
<xml_diff>
--- a/docs/Deploiement_technique_Ubuntu_Log_Integrite.docx
+++ b/docs/Deploiement_technique_Ubuntu_Log_Integrite.docx
@@ -43,7 +43,7 @@
         <w:rPr>
           <w:lang w:val="fr-FR"/>
         </w:rPr>
-        <w:t xml:space="preserve">Version 1.0 — 2 octobre 2026</w:t>
+        <w:t xml:space="preserve">Version 1.1 — 3 octobre 2026</w:t>
       </w:r>
     </w:p>
     <w:p>
@@ -6586,7 +6586,7 @@
           <w:rStyle w:val="VerbatimChar"/>
           <w:lang w:val="fr-FR"/>
         </w:rPr>
-        <w:t xml:space="preserve">now at version v10</w:t>
+        <w:t xml:space="preserve">now at version v11</w:t>
       </w:r>
       <w:r>
         <w:rPr>
@@ -7051,6 +7051,39 @@
                 <w:lang w:val="fr-FR"/>
               </w:rPr>
               <w:t xml:space="preserve">Date d’expiration des comptes</w:t>
+            </w:r>
+          </w:p>
+        </w:tc>
+      </w:tr>
+      <w:tr>
+        <w:trPr>
+          <w:cantSplit/>
+        </w:trPr>
+        <w:tc>
+          <w:tcPr/>
+          <w:p>
+            <w:pPr>
+              <w:pStyle w:val="Compact"/>
+            </w:pPr>
+            <w:r>
+              <w:rPr>
+                <w:lang w:val="fr-FR"/>
+              </w:rPr>
+              <w:t xml:space="preserve">V11</w:t>
+            </w:r>
+          </w:p>
+        </w:tc>
+        <w:tc>
+          <w:tcPr/>
+          <w:p>
+            <w:pPr>
+              <w:pStyle w:val="Compact"/>
+            </w:pPr>
+            <w:r>
+              <w:rPr>
+                <w:lang w:val="fr-FR"/>
+              </w:rPr>
+              <w:t xml:space="preserve">NIP des personnes physiques (unique, 17 caractères)</w:t>
             </w:r>
           </w:p>
         </w:tc>

</xml_diff>

<commit_message>
docs: document de deploiement v1.2 (migrations V12/V13, procedure verifiee, pieges, etats trimestriels)
Co-Authored-By: Claude Sonnet 5.5 <noreply@anthropic.com>
</commit_message>
<xml_diff>
--- a/docs/Deploiement_technique_Ubuntu_Log_Integrite.docx
+++ b/docs/Deploiement_technique_Ubuntu_Log_Integrite.docx
@@ -43,7 +43,7 @@
         <w:rPr>
           <w:lang w:val="fr-FR"/>
         </w:rPr>
-        <w:t xml:space="preserve">Version 1.1 — 3 octobre 2026</w:t>
+        <w:t xml:space="preserve">Version 1.2 — 7 octobre 2026</w:t>
       </w:r>
     </w:p>
     <w:p>
@@ -6586,7 +6586,7 @@
           <w:rStyle w:val="VerbatimChar"/>
           <w:lang w:val="fr-FR"/>
         </w:rPr>
-        <w:t xml:space="preserve">now at version v11</w:t>
+        <w:t xml:space="preserve">now at version v13</w:t>
       </w:r>
       <w:r>
         <w:rPr>
@@ -7084,6 +7084,72 @@
                 <w:lang w:val="fr-FR"/>
               </w:rPr>
               <w:t xml:space="preserve">NIP des personnes physiques (unique, 17 caractères)</w:t>
+            </w:r>
+          </w:p>
+        </w:tc>
+      </w:tr>
+      <w:tr>
+        <w:trPr>
+          <w:cantSplit/>
+        </w:trPr>
+        <w:tc>
+          <w:tcPr/>
+          <w:p>
+            <w:pPr>
+              <w:pStyle w:val="Compact"/>
+            </w:pPr>
+            <w:r>
+              <w:rPr>
+                <w:lang w:val="fr-FR"/>
+              </w:rPr>
+              <w:t xml:space="preserve">V12</w:t>
+            </w:r>
+          </w:p>
+        </w:tc>
+        <w:tc>
+          <w:tcPr/>
+          <w:p>
+            <w:pPr>
+              <w:pStyle w:val="Compact"/>
+            </w:pPr>
+            <w:r>
+              <w:rPr>
+                <w:lang w:val="fr-FR"/>
+              </w:rPr>
+              <w:t xml:space="preserve">Statut judiciaire initial cohérent (Enquête préliminaire, porté aussi par l’implication)</w:t>
+            </w:r>
+          </w:p>
+        </w:tc>
+      </w:tr>
+      <w:tr>
+        <w:trPr>
+          <w:cantSplit/>
+        </w:trPr>
+        <w:tc>
+          <w:tcPr/>
+          <w:p>
+            <w:pPr>
+              <w:pStyle w:val="Compact"/>
+            </w:pPr>
+            <w:r>
+              <w:rPr>
+                <w:lang w:val="fr-FR"/>
+              </w:rPr>
+              <w:t xml:space="preserve">V13</w:t>
+            </w:r>
+          </w:p>
+        </w:tc>
+        <w:tc>
+          <w:tcPr/>
+          <w:p>
+            <w:pPr>
+              <w:pStyle w:val="Compact"/>
+            </w:pPr>
+            <w:r>
+              <w:rPr>
+                <w:lang w:val="fr-FR"/>
+              </w:rPr>
+              <w:t xml:space="preserve">Archive des états trimestriels des personnes fichées (table audit.etat_trimestriel, non supprimable)</w:t>
             </w:r>
           </w:p>
         </w:tc>
@@ -9932,6 +9998,796 @@
     <w:bookmarkStart w:id="46" w:name="exploitation-et-supervision"/>
     <w:p>
       <w:pPr>
+        <w:pStyle w:val="Heading2"/>
+      </w:pPr>
+      <w:r>
+        <w:rPr>
+          <w:rStyle w:val="SectionNumber"/>
+          <w:lang w:val="fr-FR"/>
+        </w:rPr>
+        <w:t xml:space="preserve">14.2</w:t>
+      </w:r>
+      <w:r>
+        <w:tab/>
+      </w:r>
+      <w:r>
+        <w:rPr>
+          <w:lang w:val="fr-FR"/>
+        </w:rPr>
+        <w:t xml:space="preserve">Mise à jour avec migration : procédure vérifiée (versions 12 et 13)</w:t>
+      </w:r>
+    </w:p>
+    <w:p>
+      <w:pPr>
+        <w:pStyle w:val="BodyText"/>
+      </w:pPr>
+      <w:r>
+        <w:rPr>
+          <w:lang w:val="fr-FR"/>
+        </w:rPr>
+        <w:t xml:space="preserve">Cette procédure a été appliquée sur log-int pour les migrations V12 et V13. Elle complète les étapes 1 à 4 ci-dessus avec des contrôles qui ont servi. Le code doit d’abord avoir été poussé sur GitHub depuis le poste de développement : le serveur ne voit que GitHub.</w:t>
+      </w:r>
+    </w:p>
+    <w:p>
+      <w:pPr>
+        <w:pStyle w:val="FirstParagraph"/>
+      </w:pPr>
+      <w:r>
+        <w:rPr>
+          <w:b/>
+          <w:bCs/>
+          <w:lang w:val="fr-FR"/>
+        </w:rPr>
+        <w:t xml:space="preserve">Étape A — Sauvegarde, puis contrôle de la sauvegarde</w:t>
+      </w:r>
+    </w:p>
+    <w:p>
+      <w:pPr>
+        <w:pStyle w:val="SourceCode"/>
+      </w:pPr>
+      <w:r>
+        <w:rPr>
+          <w:rStyle w:val="VerbatimChar"/>
+          <w:lang w:val="fr-FR"/>
+        </w:rPr>
+        <w:t xml:space="preserve">cd ~/logintegrite_backend &amp;&amp; git pull origin production</w:t>
+      </w:r>
+    </w:p>
+    <w:p>
+      <w:pPr>
+        <w:pStyle w:val="SourceCode"/>
+      </w:pPr>
+      <w:r>
+        <w:rPr>
+          <w:rStyle w:val="VerbatimChar"/>
+          <w:lang w:val="fr-FR"/>
+        </w:rPr>
+        <w:t xml:space="preserve">docker compose -f docker-compose.prod.yml --env-file .env.prod exec -T postgres pg_dump -U lip_admin -d logintegrite_db | gzip &gt; ~/avant-v13-$(date +%F).sql.gz</w:t>
+      </w:r>
+    </w:p>
+    <w:p>
+      <w:pPr>
+        <w:pStyle w:val="SourceCode"/>
+      </w:pPr>
+      <w:r>
+        <w:rPr>
+          <w:rStyle w:val="VerbatimChar"/>
+          <w:lang w:val="fr-FR"/>
+        </w:rPr>
+        <w:t xml:space="preserve">ls -lh ~/avant-v13-*.sql.gz</w:t>
+      </w:r>
+    </w:p>
+    <w:p>
+      <w:pPr>
+        <w:pStyle w:val="SourceCode"/>
+      </w:pPr>
+      <w:r>
+        <w:rPr>
+          <w:rStyle w:val="VerbatimChar"/>
+          <w:lang w:val="fr-FR"/>
+        </w:rPr>
+        <w:t xml:space="preserve">gunzip -c ~/avant-v13-$(date +%F).sql.gz | head -5</w:t>
+      </w:r>
+    </w:p>
+    <w:p>
+      <w:pPr>
+        <w:pStyle w:val="SourceCode"/>
+      </w:pPr>
+      <w:r>
+        <w:rPr>
+          <w:rStyle w:val="VerbatimChar"/>
+          <w:lang w:val="fr-FR"/>
+        </w:rPr>
+        <w:t xml:space="preserve">gunzip -c ~/avant-v13-$(date +%F).sql.gz | tail -3</w:t>
+      </w:r>
+    </w:p>
+    <w:p>
+      <w:pPr>
+        <w:pStyle w:val="SourceCode"/>
+      </w:pPr>
+      <w:r>
+        <w:rPr>
+          <w:rStyle w:val="VerbatimChar"/>
+          <w:lang w:val="fr-FR"/>
+        </w:rPr>
+        <w:t xml:space="preserve">gunzip -c ~/avant-v13-$(date +%F).sql.gz | grep -c "^COPY"</w:t>
+      </w:r>
+    </w:p>
+    <w:p>
+      <w:pPr>
+        <w:pStyle w:val="BodyText"/>
+      </w:pPr>
+      <w:r>
+        <w:rPr>
+          <w:lang w:val="fr-FR"/>
+        </w:rPr>
+        <w:t xml:space="preserve">Résultat attendu : un fichier d’environ 16 Ko (la taille dépend des données), un début qui commence par </w:t>
+      </w:r>
+      <w:r>
+        <w:rPr>
+          <w:rStyle w:val="VerbatimChar"/>
+          <w:lang w:val="fr-FR"/>
+        </w:rPr>
+        <w:t xml:space="preserve">-- PostgreSQL database dump</w:t>
+      </w:r>
+      <w:r>
+        <w:rPr>
+          <w:lang w:val="fr-FR"/>
+        </w:rPr>
+        <w:t xml:space="preserve">, une fin qui se termine par </w:t>
+      </w:r>
+      <w:r>
+        <w:rPr>
+          <w:rStyle w:val="VerbatimChar"/>
+          <w:lang w:val="fr-FR"/>
+        </w:rPr>
+        <w:t xml:space="preserve">\unrestrict</w:t>
+      </w:r>
+      <w:r>
+        <w:rPr>
+          <w:lang w:val="fr-FR"/>
+        </w:rPr>
+        <w:t xml:space="preserve">, et 32 lignes </w:t>
+      </w:r>
+      <w:r>
+        <w:rPr>
+          <w:rStyle w:val="VerbatimChar"/>
+          <w:lang w:val="fr-FR"/>
+        </w:rPr>
+        <w:t xml:space="preserve">COPY</w:t>
+      </w:r>
+      <w:r>
+        <w:rPr>
+          <w:lang w:val="fr-FR"/>
+        </w:rPr>
+        <w:t xml:space="preserve"> (une par table). Si l’un de ces contrôles échoue, ne reconstruisez rien.</w:t>
+      </w:r>
+    </w:p>
+    <w:p>
+      <w:pPr>
+        <w:pStyle w:val="FirstParagraph"/>
+      </w:pPr>
+      <w:r>
+        <w:rPr>
+          <w:b/>
+          <w:bCs/>
+          <w:lang w:val="fr-FR"/>
+        </w:rPr>
+        <w:t xml:space="preserve">Étape B — Reconstruire le backend seul et vérifier la migration</w:t>
+      </w:r>
+    </w:p>
+    <w:p>
+      <w:pPr>
+        <w:pStyle w:val="SourceCode"/>
+      </w:pPr>
+      <w:r>
+        <w:rPr>
+          <w:rStyle w:val="VerbatimChar"/>
+          <w:lang w:val="fr-FR"/>
+        </w:rPr>
+        <w:t xml:space="preserve">docker compose -f docker-compose.prod.yml --env-file .env.prod up -d --build backend</w:t>
+      </w:r>
+    </w:p>
+    <w:p>
+      <w:pPr>
+        <w:pStyle w:val="SourceCode"/>
+      </w:pPr>
+      <w:r>
+        <w:rPr>
+          <w:rStyle w:val="VerbatimChar"/>
+          <w:lang w:val="fr-FR"/>
+        </w:rPr>
+        <w:t xml:space="preserve">docker compose -f docker-compose.prod.yml --env-file .env.prod logs --since 5m backend | grep -E "version \"13|Started|ERROR"</w:t>
+      </w:r>
+    </w:p>
+    <w:p>
+      <w:pPr>
+        <w:pStyle w:val="SourceCode"/>
+      </w:pPr>
+      <w:r>
+        <w:rPr>
+          <w:rStyle w:val="VerbatimChar"/>
+          <w:lang w:val="fr-FR"/>
+        </w:rPr>
+        <w:t xml:space="preserve">docker compose -f docker-compose.prod.yml --env-file .env.prod exec -T postgres psql -U lip_admin -d logintegrite_db -c "select version, success from core.flyway_schema_history order by installed_rank desc limit 2;"</w:t>
+      </w:r>
+    </w:p>
+    <w:p>
+      <w:pPr>
+        <w:pStyle w:val="BodyText"/>
+      </w:pPr>
+      <w:r>
+        <w:rPr>
+          <w:lang w:val="fr-FR"/>
+        </w:rPr>
+        <w:t xml:space="preserve">Résultat attendu : la ligne </w:t>
+      </w:r>
+      <w:r>
+        <w:rPr>
+          <w:rStyle w:val="VerbatimChar"/>
+          <w:lang w:val="fr-FR"/>
+        </w:rPr>
+        <w:t xml:space="preserve">Migrating schema "core" to version "13 - etat trimestriel"</w:t>
+      </w:r>
+      <w:r>
+        <w:rPr>
+          <w:lang w:val="fr-FR"/>
+        </w:rPr>
+        <w:t xml:space="preserve">, puis </w:t>
+      </w:r>
+      <w:r>
+        <w:rPr>
+          <w:rStyle w:val="VerbatimChar"/>
+          <w:lang w:val="fr-FR"/>
+        </w:rPr>
+        <w:t xml:space="preserve">Started LogintegriteBackendApplication</w:t>
+      </w:r>
+      <w:r>
+        <w:rPr>
+          <w:lang w:val="fr-FR"/>
+        </w:rPr>
+        <w:t xml:space="preserve">, puis la version 13 avec </w:t>
+      </w:r>
+      <w:r>
+        <w:rPr>
+          <w:rStyle w:val="VerbatimChar"/>
+          <w:lang w:val="fr-FR"/>
+        </w:rPr>
+        <w:t xml:space="preserve">success = t</w:t>
+      </w:r>
+      <w:r>
+        <w:rPr>
+          <w:lang w:val="fr-FR"/>
+        </w:rPr>
+        <w:t xml:space="preserve">.</w:t>
+      </w:r>
+    </w:p>
+    <w:p>
+      <w:pPr>
+        <w:pStyle w:val="FirstParagraph"/>
+      </w:pPr>
+      <w:r>
+        <w:rPr>
+          <w:b/>
+          <w:bCs/>
+          <w:lang w:val="fr-FR"/>
+        </w:rPr>
+        <w:t xml:space="preserve">Étape C — Frontend, seulement après un backend sain</w:t>
+      </w:r>
+    </w:p>
+    <w:p>
+      <w:pPr>
+        <w:pStyle w:val="SourceCode"/>
+      </w:pPr>
+      <w:r>
+        <w:rPr>
+          <w:rStyle w:val="VerbatimChar"/>
+          <w:lang w:val="fr-FR"/>
+        </w:rPr>
+        <w:t xml:space="preserve">cd ~/logintegrite_frontend &amp;&amp; git pull origin production</w:t>
+      </w:r>
+    </w:p>
+    <w:p>
+      <w:pPr>
+        <w:pStyle w:val="SourceCode"/>
+      </w:pPr>
+      <w:r>
+        <w:rPr>
+          <w:rStyle w:val="VerbatimChar"/>
+          <w:lang w:val="fr-FR"/>
+        </w:rPr>
+        <w:t xml:space="preserve">cd ~/logintegrite_backend</w:t>
+      </w:r>
+    </w:p>
+    <w:p>
+      <w:pPr>
+        <w:pStyle w:val="SourceCode"/>
+      </w:pPr>
+      <w:r>
+        <w:rPr>
+          <w:rStyle w:val="VerbatimChar"/>
+          <w:lang w:val="fr-FR"/>
+        </w:rPr>
+        <w:t xml:space="preserve">docker compose -f docker-compose.prod.yml --env-file .env.prod up -d --build frontend</w:t>
+      </w:r>
+    </w:p>
+    <w:p>
+      <w:pPr>
+        <w:pStyle w:val="SourceCode"/>
+      </w:pPr>
+      <w:r>
+        <w:rPr>
+          <w:rStyle w:val="VerbatimChar"/>
+          <w:lang w:val="fr-FR"/>
+        </w:rPr>
+        <w:t xml:space="preserve">docker compose -f docker-compose.prod.yml --env-file .env.prod ps</w:t>
+      </w:r>
+    </w:p>
+    <w:p>
+      <w:pPr>
+        <w:pStyle w:val="BodyText"/>
+      </w:pPr>
+      <w:r>
+        <w:rPr>
+          <w:lang w:val="fr-FR"/>
+        </w:rPr>
+        <w:t xml:space="preserve">Résultat attendu : </w:t>
+      </w:r>
+      <w:r>
+        <w:rPr>
+          <w:rStyle w:val="VerbatimChar"/>
+          <w:lang w:val="fr-FR"/>
+        </w:rPr>
+        <w:t xml:space="preserve">lip-backend</w:t>
+      </w:r>
+      <w:r>
+        <w:rPr>
+          <w:lang w:val="fr-FR"/>
+        </w:rPr>
+        <w:t xml:space="preserve"> et </w:t>
+      </w:r>
+      <w:r>
+        <w:rPr>
+          <w:rStyle w:val="VerbatimChar"/>
+          <w:lang w:val="fr-FR"/>
+        </w:rPr>
+        <w:t xml:space="preserve">lip-frontend</w:t>
+      </w:r>
+      <w:r>
+        <w:rPr>
+          <w:lang w:val="fr-FR"/>
+        </w:rPr>
+        <w:t xml:space="preserve"> en </w:t>
+      </w:r>
+      <w:r>
+        <w:rPr>
+          <w:rStyle w:val="VerbatimChar"/>
+          <w:lang w:val="fr-FR"/>
+        </w:rPr>
+        <w:t xml:space="preserve">healthy</w:t>
+      </w:r>
+      <w:r>
+        <w:rPr>
+          <w:lang w:val="fr-FR"/>
+        </w:rPr>
+        <w:t xml:space="preserve">. Dans le navigateur, faire Ctrl+F5 pour ne pas garder l’ancienne version de l’application en cache.</w:t>
+      </w:r>
+    </w:p>
+    <w:p>
+      <w:pPr>
+        <w:pStyle w:val="Heading2"/>
+      </w:pPr>
+      <w:r>
+        <w:rPr>
+          <w:rStyle w:val="SectionNumber"/>
+          <w:lang w:val="fr-FR"/>
+        </w:rPr>
+        <w:t xml:space="preserve">14.3</w:t>
+      </w:r>
+      <w:r>
+        <w:tab/>
+      </w:r>
+      <w:r>
+        <w:rPr>
+          <w:lang w:val="fr-FR"/>
+        </w:rPr>
+        <w:t xml:space="preserve">Pièges rencontrés lors des déploiements V12 et V13</w:t>
+      </w:r>
+    </w:p>
+    <w:p>
+      <w:pPr>
+        <w:pStyle w:val="BlockText"/>
+      </w:pPr>
+      <w:r>
+        <w:rPr>
+          <w:b/>
+          <w:bCs/>
+          <w:lang w:val="fr-FR"/>
+        </w:rPr>
+        <w:t xml:space="preserve">Sauvegarde vide.</w:t>
+      </w:r>
+      <w:r>
+        <w:rPr>
+          <w:lang w:val="fr-FR"/>
+        </w:rPr>
+        <w:t xml:space="preserve"> </w:t>
+      </w:r>
+      <w:r>
+        <w:rPr>
+          <w:lang w:val="fr-FR"/>
+        </w:rPr>
+        <w:t xml:space="preserve">Le fichier de sauvegarde ne faisait que 111 octets : c’est un fichier compressé sans contenu, la commande </w:t>
+      </w:r>
+      <w:r>
+        <w:rPr>
+          <w:rStyle w:val="VerbatimChar"/>
+          <w:lang w:val="fr-FR"/>
+        </w:rPr>
+        <w:t xml:space="preserve">pg_dump</w:t>
+      </w:r>
+      <w:r>
+        <w:rPr>
+          <w:lang w:val="fr-FR"/>
+        </w:rPr>
+        <w:t xml:space="preserve"> n’avait rien produit. Cause : un </w:t>
+      </w:r>
+      <w:r>
+        <w:rPr>
+          <w:rStyle w:val="VerbatimChar"/>
+          <w:lang w:val="fr-FR"/>
+        </w:rPr>
+        <w:t xml:space="preserve">\</w:t>
+      </w:r>
+      <w:r>
+        <w:rPr>
+          <w:lang w:val="fr-FR"/>
+        </w:rPr>
+        <w:t xml:space="preserve"> suivi d’espaces en fin de ligne coupe la commande. Remède : taper la commande sur une seule ligne (comme à l’étape A) et toujours contrôler la taille puis le contenu du fichier avant de continuer.</w:t>
+      </w:r>
+    </w:p>
+    <w:p>
+      <w:pPr>
+        <w:pStyle w:val="BlockText"/>
+      </w:pPr>
+      <w:r>
+        <w:rPr>
+          <w:b/>
+          <w:bCs/>
+          <w:lang w:val="fr-FR"/>
+        </w:rPr>
+        <w:t xml:space="preserve">Variables vides.</w:t>
+      </w:r>
+      <w:r>
+        <w:rPr>
+          <w:lang w:val="fr-FR"/>
+        </w:rPr>
+        <w:t xml:space="preserve"> </w:t>
+      </w:r>
+      <w:r>
+        <w:rPr>
+          <w:lang w:val="fr-FR"/>
+        </w:rPr>
+        <w:t xml:space="preserve">Une commande </w:t>
+      </w:r>
+      <w:r>
+        <w:rPr>
+          <w:rStyle w:val="VerbatimChar"/>
+          <w:lang w:val="fr-FR"/>
+        </w:rPr>
+        <w:t xml:space="preserve">docker compose</w:t>
+      </w:r>
+      <w:r>
+        <w:rPr>
+          <w:lang w:val="fr-FR"/>
+        </w:rPr>
+        <w:t xml:space="preserve"> lancée sans </w:t>
+      </w:r>
+      <w:r>
+        <w:rPr>
+          <w:rStyle w:val="VerbatimChar"/>
+          <w:lang w:val="fr-FR"/>
+        </w:rPr>
+        <w:t xml:space="preserve">--env-file .env.prod</w:t>
+      </w:r>
+      <w:r>
+        <w:rPr>
+          <w:lang w:val="fr-FR"/>
+        </w:rPr>
+        <w:t xml:space="preserve"> (même une simple </w:t>
+      </w:r>
+      <w:r>
+        <w:rPr>
+          <w:rStyle w:val="VerbatimChar"/>
+          <w:lang w:val="fr-FR"/>
+        </w:rPr>
+        <w:t xml:space="preserve">config --services</w:t>
+      </w:r>
+      <w:r>
+        <w:rPr>
+          <w:lang w:val="fr-FR"/>
+        </w:rPr>
+        <w:t xml:space="preserve">) affiche « The "DOMAIN" variable is not set » puis des erreurs d’interpolation. Remède : ajouter </w:t>
+      </w:r>
+      <w:r>
+        <w:rPr>
+          <w:rStyle w:val="VerbatimChar"/>
+          <w:lang w:val="fr-FR"/>
+        </w:rPr>
+        <w:t xml:space="preserve">--env-file .env.prod</w:t>
+      </w:r>
+      <w:r>
+        <w:rPr>
+          <w:lang w:val="fr-FR"/>
+        </w:rPr>
+        <w:t xml:space="preserve"> à toutes les commandes </w:t>
+      </w:r>
+      <w:r>
+        <w:rPr>
+          <w:rStyle w:val="VerbatimChar"/>
+          <w:lang w:val="fr-FR"/>
+        </w:rPr>
+        <w:t xml:space="preserve">docker compose</w:t>
+      </w:r>
+      <w:r>
+        <w:rPr>
+          <w:lang w:val="fr-FR"/>
+        </w:rPr>
+        <w:t xml:space="preserve">, sans exception : un </w:t>
+      </w:r>
+      <w:r>
+        <w:rPr>
+          <w:rStyle w:val="VerbatimChar"/>
+          <w:lang w:val="fr-FR"/>
+        </w:rPr>
+        <w:t xml:space="preserve">up</w:t>
+      </w:r>
+      <w:r>
+        <w:rPr>
+          <w:lang w:val="fr-FR"/>
+        </w:rPr>
+        <w:t xml:space="preserve"> lancé sans cette option pourrait recréer des conteneurs avec des mots de passe vides.</w:t>
+      </w:r>
+    </w:p>
+    <w:p>
+      <w:pPr>
+        <w:pStyle w:val="BlockText"/>
+      </w:pPr>
+      <w:r>
+        <w:rPr>
+          <w:b/>
+          <w:bCs/>
+          <w:lang w:val="fr-FR"/>
+        </w:rPr>
+        <w:t xml:space="preserve">Journaux d’un ancien démarrage.</w:t>
+      </w:r>
+      <w:r>
+        <w:rPr>
+          <w:lang w:val="fr-FR"/>
+        </w:rPr>
+        <w:t xml:space="preserve"> </w:t>
+      </w:r>
+      <w:r>
+        <w:rPr>
+          <w:rStyle w:val="VerbatimChar"/>
+          <w:lang w:val="fr-FR"/>
+        </w:rPr>
+        <w:t xml:space="preserve">logs backend</w:t>
+      </w:r>
+      <w:r>
+        <w:rPr>
+          <w:lang w:val="fr-FR"/>
+        </w:rPr>
+        <w:t xml:space="preserve"> sans </w:t>
+      </w:r>
+      <w:r>
+        <w:rPr>
+          <w:rStyle w:val="VerbatimChar"/>
+          <w:lang w:val="fr-FR"/>
+        </w:rPr>
+        <w:t xml:space="preserve">--since</w:t>
+      </w:r>
+      <w:r>
+        <w:rPr>
+          <w:lang w:val="fr-FR"/>
+        </w:rPr>
+        <w:t xml:space="preserve"> montre aussi l’ancien conteneur : on croit la migration appliquée alors qu’elle ne l’est pas. Remède : utiliser </w:t>
+      </w:r>
+      <w:r>
+        <w:rPr>
+          <w:rStyle w:val="VerbatimChar"/>
+          <w:lang w:val="fr-FR"/>
+        </w:rPr>
+        <w:t xml:space="preserve">--since 5m</w:t>
+      </w:r>
+      <w:r>
+        <w:rPr>
+          <w:lang w:val="fr-FR"/>
+        </w:rPr>
+        <w:t xml:space="preserve"> et vérifier la date des lignes affichées.</w:t>
+      </w:r>
+    </w:p>
+    <w:p>
+      <w:pPr>
+        <w:pStyle w:val="BlockText"/>
+      </w:pPr>
+      <w:r>
+        <w:rPr>
+          <w:b/>
+          <w:bCs/>
+          <w:lang w:val="fr-FR"/>
+        </w:rPr>
+        <w:t xml:space="preserve">« Already up to date » et construction « CACHED ».</w:t>
+      </w:r>
+      <w:r>
+        <w:rPr>
+          <w:lang w:val="fr-FR"/>
+        </w:rPr>
+        <w:t xml:space="preserve"> </w:t>
+      </w:r>
+      <w:r>
+        <w:rPr>
+          <w:lang w:val="fr-FR"/>
+        </w:rPr>
+        <w:t xml:space="preserve">Le code est déjà à jour et déjà déployé, ce n’est pas un échec. Contrôle pour le frontend : </w:t>
+      </w:r>
+      <w:r>
+        <w:rPr>
+          <w:rStyle w:val="VerbatimChar"/>
+          <w:lang w:val="fr-FR"/>
+        </w:rPr>
+        <w:t xml:space="preserve">docker compose … exec -T frontend sh -c 'grep -rl "etats-trimestriels" /usr/share/nginx/html | head -3'</w:t>
+      </w:r>
+      <w:r>
+        <w:rPr>
+          <w:lang w:val="fr-FR"/>
+        </w:rPr>
+        <w:t xml:space="preserve"> doit afficher des fichiers </w:t>
+      </w:r>
+      <w:r>
+        <w:rPr>
+          <w:rStyle w:val="VerbatimChar"/>
+          <w:lang w:val="fr-FR"/>
+        </w:rPr>
+        <w:t xml:space="preserve">.js</w:t>
+      </w:r>
+      <w:r>
+        <w:rPr>
+          <w:lang w:val="fr-FR"/>
+        </w:rPr>
+        <w:t xml:space="preserve">. Le </w:t>
+      </w:r>
+      <w:r>
+        <w:rPr>
+          <w:rStyle w:val="VerbatimChar"/>
+          <w:lang w:val="fr-FR"/>
+        </w:rPr>
+        <w:t xml:space="preserve">ps</w:t>
+      </w:r>
+      <w:r>
+        <w:rPr>
+          <w:lang w:val="fr-FR"/>
+        </w:rPr>
+        <w:t xml:space="preserve"> peut afficher </w:t>
+      </w:r>
+      <w:r>
+        <w:rPr>
+          <w:rStyle w:val="VerbatimChar"/>
+          <w:lang w:val="fr-FR"/>
+        </w:rPr>
+        <w:t xml:space="preserve">sha256:…</w:t>
+      </w:r>
+      <w:r>
+        <w:rPr>
+          <w:lang w:val="fr-FR"/>
+        </w:rPr>
+        <w:t xml:space="preserve"> à la place du nom de l’image : c’est sans conséquence.</w:t>
+      </w:r>
+    </w:p>
+    <w:p>
+      <w:pPr>
+        <w:pStyle w:val="BlockText"/>
+      </w:pPr>
+      <w:r>
+        <w:rPr>
+          <w:b/>
+          <w:bCs/>
+          <w:lang w:val="fr-FR"/>
+        </w:rPr>
+        <w:t xml:space="preserve">Mauvais endroit pour une commande.</w:t>
+      </w:r>
+      <w:r>
+        <w:rPr>
+          <w:lang w:val="fr-FR"/>
+        </w:rPr>
+        <w:t xml:space="preserve"> </w:t>
+      </w:r>
+      <w:r>
+        <w:rPr>
+          <w:lang w:val="fr-FR"/>
+        </w:rPr>
+        <w:t xml:space="preserve">Les chemins </w:t>
+      </w:r>
+      <w:r>
+        <w:rPr>
+          <w:rStyle w:val="VerbatimChar"/>
+          <w:lang w:val="fr-FR"/>
+        </w:rPr>
+        <w:t xml:space="preserve">~/Documents/LAB/…</w:t>
+      </w:r>
+      <w:r>
+        <w:rPr>
+          <w:lang w:val="fr-FR"/>
+        </w:rPr>
+        <w:t xml:space="preserve"> sont ceux du poste de développement Windows ; ils n’existent pas sur le serveur, qui n’a que </w:t>
+      </w:r>
+      <w:r>
+        <w:rPr>
+          <w:rStyle w:val="VerbatimChar"/>
+          <w:lang w:val="fr-FR"/>
+        </w:rPr>
+        <w:t xml:space="preserve">~/logintegrite_backend</w:t>
+      </w:r>
+      <w:r>
+        <w:rPr>
+          <w:lang w:val="fr-FR"/>
+        </w:rPr>
+        <w:t xml:space="preserve"> et </w:t>
+      </w:r>
+      <w:r>
+        <w:rPr>
+          <w:rStyle w:val="VerbatimChar"/>
+          <w:lang w:val="fr-FR"/>
+        </w:rPr>
+        <w:t xml:space="preserve">~/logintegrite_frontend</w:t>
+      </w:r>
+      <w:r>
+        <w:rPr>
+          <w:lang w:val="fr-FR"/>
+        </w:rPr>
+        <w:t xml:space="preserve">. Le </w:t>
+      </w:r>
+      <w:r>
+        <w:rPr>
+          <w:rStyle w:val="VerbatimChar"/>
+          <w:lang w:val="fr-FR"/>
+        </w:rPr>
+        <w:t xml:space="preserve">git push</w:t>
+      </w:r>
+      <w:r>
+        <w:rPr>
+          <w:lang w:val="fr-FR"/>
+        </w:rPr>
+        <w:t xml:space="preserve"> se fait depuis le poste ; le </w:t>
+      </w:r>
+      <w:r>
+        <w:rPr>
+          <w:rStyle w:val="VerbatimChar"/>
+          <w:lang w:val="fr-FR"/>
+        </w:rPr>
+        <w:t xml:space="preserve">git pull</w:t>
+      </w:r>
+      <w:r>
+        <w:rPr>
+          <w:lang w:val="fr-FR"/>
+        </w:rPr>
+        <w:t xml:space="preserve"> et </w:t>
+      </w:r>
+      <w:r>
+        <w:rPr>
+          <w:rStyle w:val="VerbatimChar"/>
+          <w:lang w:val="fr-FR"/>
+        </w:rPr>
+        <w:t xml:space="preserve">docker compose</w:t>
+      </w:r>
+      <w:r>
+        <w:rPr>
+          <w:lang w:val="fr-FR"/>
+        </w:rPr>
+        <w:t xml:space="preserve"> depuis le serveur.</w:t>
+      </w:r>
+    </w:p>
+    <w:p>
+      <w:pPr>
         <w:pStyle w:val="Heading1"/>
       </w:pPr>
       <w:r>
@@ -10683,6 +11539,186 @@
     </w:p>
     <w:bookmarkEnd w:id="46"/>
     <w:bookmarkStart w:id="47" w:name="dépannage"/>
+    <w:p>
+      <w:pPr>
+        <w:pStyle w:val="Heading2"/>
+      </w:pPr>
+      <w:r>
+        <w:rPr>
+          <w:rStyle w:val="SectionNumber"/>
+          <w:lang w:val="fr-FR"/>
+        </w:rPr>
+        <w:t xml:space="preserve">15.1</w:t>
+      </w:r>
+      <w:r>
+        <w:tab/>
+      </w:r>
+      <w:r>
+        <w:rPr>
+          <w:lang w:val="fr-FR"/>
+        </w:rPr>
+        <w:t xml:space="preserve">États trimestriels des personnes fichées (depuis la version 13)</w:t>
+      </w:r>
+    </w:p>
+    <w:p>
+      <w:pPr>
+        <w:pStyle w:val="BodyText"/>
+      </w:pPr>
+      <w:r>
+        <w:rPr>
+          <w:lang w:val="fr-FR"/>
+        </w:rPr>
+        <w:t xml:space="preserve">Chaque trimestre, l’application produit un état officiel (PDF et Excel) des personnes fichées, à remettre à la hiérarchie. Aucune action manuelle n’est requise.</w:t>
+      </w:r>
+    </w:p>
+    <w:p>
+      <w:pPr>
+        <w:pStyle w:val="BodyText"/>
+      </w:pPr>
+      <w:r>
+        <w:rPr>
+          <w:lang w:val="fr-FR"/>
+        </w:rPr>
+        <w:t xml:space="preserve">Une tâche interne vérifie une fois par jour que l’état du trimestre écoulé existe, et le génère s’il manque. Elle se lance aussi 3 minutes après chaque démarrage du backend : si le serveur était éteint à la fin d’un trimestre, l’état est produit dès son retour. Les états sont conservés dans la base (</w:t>
+      </w:r>
+      <w:r>
+        <w:rPr>
+          <w:rStyle w:val="VerbatimChar"/>
+          <w:lang w:val="fr-FR"/>
+        </w:rPr>
+        <w:t xml:space="preserve">audit.etat_trimestriel</w:t>
+      </w:r>
+      <w:r>
+        <w:rPr>
+          <w:lang w:val="fr-FR"/>
+        </w:rPr>
+        <w:t xml:space="preserve">), donc inclus dans les sauvegardes. Un état n’est jamais supprimé ; une régénération marque l’ancien « remplacé » (3 régénérations au maximum par trimestre).</w:t>
+      </w:r>
+    </w:p>
+    <w:p>
+      <w:pPr>
+        <w:pStyle w:val="FirstParagraph"/>
+      </w:pPr>
+      <w:r>
+        <w:rPr>
+          <w:b/>
+          <w:bCs/>
+          <w:lang w:val="fr-FR"/>
+        </w:rPr>
+        <w:t xml:space="preserve">Vérifier la génération</w:t>
+      </w:r>
+    </w:p>
+    <w:p>
+      <w:pPr>
+        <w:pStyle w:val="SourceCode"/>
+      </w:pPr>
+      <w:r>
+        <w:rPr>
+          <w:rStyle w:val="VerbatimChar"/>
+          <w:lang w:val="fr-FR"/>
+        </w:rPr>
+        <w:t xml:space="preserve">docker compose -f docker-compose.prod.yml --env-file .env.prod exec -T postgres psql -U lip_admin -d logintegrite_db -c "select annee, trimestre, genere_par, nb_personnes, remplace, length(pdf) as taille_pdf from audit.etat_trimestriel;"</w:t>
+      </w:r>
+    </w:p>
+    <w:p>
+      <w:pPr>
+        <w:pStyle w:val="BodyText"/>
+      </w:pPr>
+      <w:r>
+        <w:rPr>
+          <w:lang w:val="fr-FR"/>
+        </w:rPr>
+        <w:t xml:space="preserve">Résultat attendu : une ligne par trimestre écoulé, avec </w:t>
+      </w:r>
+      <w:r>
+        <w:rPr>
+          <w:rStyle w:val="VerbatimChar"/>
+          <w:lang w:val="fr-FR"/>
+        </w:rPr>
+        <w:t xml:space="preserve">genere_par = SYSTEME</w:t>
+      </w:r>
+      <w:r>
+        <w:rPr>
+          <w:lang w:val="fr-FR"/>
+        </w:rPr>
+        <w:t xml:space="preserve"> pour une génération automatique et </w:t>
+      </w:r>
+      <w:r>
+        <w:rPr>
+          <w:rStyle w:val="VerbatimChar"/>
+          <w:lang w:val="fr-FR"/>
+        </w:rPr>
+        <w:t xml:space="preserve">remplace = f</w:t>
+      </w:r>
+      <w:r>
+        <w:rPr>
+          <w:lang w:val="fr-FR"/>
+        </w:rPr>
+        <w:t xml:space="preserve"> pour l’état en vigueur. Un </w:t>
+      </w:r>
+      <w:r>
+        <w:rPr>
+          <w:rStyle w:val="VerbatimChar"/>
+          <w:lang w:val="fr-FR"/>
+        </w:rPr>
+        <w:t xml:space="preserve">nb_personnes</w:t>
+      </w:r>
+      <w:r>
+        <w:rPr>
+          <w:lang w:val="fr-FR"/>
+        </w:rPr>
+        <w:t xml:space="preserve"> à 0 est normal tant que le registre officiel est vide.</w:t>
+      </w:r>
+    </w:p>
+    <w:p>
+      <w:pPr>
+        <w:pStyle w:val="BodyText"/>
+      </w:pPr>
+      <w:r>
+        <w:rPr>
+          <w:lang w:val="fr-FR"/>
+        </w:rPr>
+        <w:t xml:space="preserve">Les états se consultent et se téléchargent dans l’application : menu « Pilotage », « États trimestriels » (administrateur et validateur). Seul l’administrateur peut en générer un à la demande.</w:t>
+      </w:r>
+    </w:p>
+    <w:p>
+      <w:pPr>
+        <w:pStyle w:val="BlockText"/>
+      </w:pPr>
+      <w:r>
+        <w:rPr>
+          <w:b/>
+          <w:bCs/>
+          <w:lang w:val="fr-FR"/>
+        </w:rPr>
+        <w:t xml:space="preserve">En cas d’absence d’état.</w:t>
+      </w:r>
+      <w:r>
+        <w:rPr>
+          <w:lang w:val="fr-FR"/>
+        </w:rPr>
+        <w:t xml:space="preserve"> </w:t>
+      </w:r>
+      <w:r>
+        <w:rPr>
+          <w:lang w:val="fr-FR"/>
+        </w:rPr>
+        <w:t xml:space="preserve">Chercher dans les journaux : </w:t>
+      </w:r>
+      <w:r>
+        <w:rPr>
+          <w:rStyle w:val="VerbatimChar"/>
+          <w:lang w:val="fr-FR"/>
+        </w:rPr>
+        <w:t xml:space="preserve">docker compose … logs backend | grep -i "etat trimestriel"</w:t>
+      </w:r>
+      <w:r>
+        <w:rPr>
+          <w:lang w:val="fr-FR"/>
+        </w:rPr>
+        <w:t xml:space="preserve">. Le message « Generation de l’etat trimestriel impossible » donne la cause ; la tâche réessaie au passage suivant.</w:t>
+      </w:r>
+    </w:p>
     <w:p>
       <w:pPr>
         <w:pStyle w:val="Heading1"/>

</xml_diff>

<commit_message>
docs: deploiement v1.3 (messagerie et mot de passe oublie, section 11.2)
Co-Authored-By: Claude Sonnet 5.5 <noreply@anthropic.com>
</commit_message>
<xml_diff>
--- a/docs/Deploiement_technique_Ubuntu_Log_Integrite.docx
+++ b/docs/Deploiement_technique_Ubuntu_Log_Integrite.docx
@@ -43,7 +43,7 @@
         <w:rPr>
           <w:lang w:val="fr-FR"/>
         </w:rPr>
-        <w:t xml:space="preserve">Version 1.2 — 7 octobre 2026</w:t>
+        <w:t xml:space="preserve">Version 1.3 — 8 octobre 2026</w:t>
       </w:r>
     </w:p>
     <w:p>
@@ -7642,60 +7642,68 @@
         <w:rPr>
           <w:lang w:val="fr-FR"/>
         </w:rPr>
-        <w:t xml:space="preserve">Réglage 1 : retirer « mot de passe oublié »</w:t>
-      </w:r>
-    </w:p>
-    <w:p>
-      <w:pPr>
-        <w:pStyle w:val="FirstParagraph"/>
-      </w:pPr>
-      <w:r>
-        <w:rPr>
-          <w:lang w:val="fr-FR"/>
-        </w:rPr>
-        <w:t xml:space="preserve">Tant qu’aucun serveur de messagerie n’est configuré dans Keycloak, le lien ne mènerait à rien.</w:t>
-      </w:r>
-    </w:p>
-    <w:p>
-      <w:pPr>
-        <w:pStyle w:val="SourceCode"/>
-      </w:pPr>
-      <w:r>
-        <w:rPr>
-          <w:rStyle w:val="VerbatimChar"/>
-          <w:lang w:val="fr-FR"/>
-        </w:rPr>
-        <w:t xml:space="preserve">docker compose -f docker-compose.prod.yml --env-file .env.prod exec -T keycloak sh -c '</w:t>
-      </w:r>
-      <w:r>
-        <w:br/>
-      </w:r>
-      <w:r>
-        <w:rPr>
-          <w:rStyle w:val="VerbatimChar"/>
-          <w:lang w:val="fr-FR"/>
-        </w:rPr>
-        <w:t xml:space="preserve">/opt/keycloak/bin/kcadm.sh config credentials --server http://localhost:8080/auth --realm master \</w:t>
-      </w:r>
-      <w:r>
-        <w:br/>
-      </w:r>
-      <w:r>
-        <w:rPr>
-          <w:rStyle w:val="VerbatimChar"/>
-          <w:lang w:val="fr-FR"/>
-        </w:rPr>
-        <w:t xml:space="preserve">  --user "$KC_BOOTSTRAP_ADMIN_USERNAME" --password "$KC_BOOTSTRAP_ADMIN_PASSWORD" &gt;/dev/null &amp;&amp;</w:t>
-      </w:r>
-      <w:r>
-        <w:br/>
-      </w:r>
-      <w:r>
-        <w:rPr>
-          <w:rStyle w:val="VerbatimChar"/>
-          <w:lang w:val="fr-FR"/>
-        </w:rPr>
-        <w:t xml:space="preserve">/opt/keycloak/bin/kcadm.sh update realms/logintegrite -s resetPasswordAllowed=false &amp;&amp; echo OK'</w:t>
+        <w:t xml:space="preserve">Réglage 1 : messagerie et « mot de passe oublié »</w:t>
+      </w:r>
+    </w:p>
+    <w:p>
+      <w:pPr>
+        <w:pStyle w:val="BodyText"/>
+      </w:pPr>
+      <w:r>
+        <w:rPr>
+          <w:lang w:val="fr-FR"/>
+        </w:rPr>
+        <w:t xml:space="preserve">Le lien « Mot de passe oublié ? » de l’écran de connexion permet à un utilisateur de choisir un nouveau mot de passe grâce à un courriel. Il s’appuie sur la boîte dédiée </w:t>
+      </w:r>
+      <w:r>
+        <w:rPr>
+          <w:rStyle w:val="VerbatimChar"/>
+          <w:lang w:val="fr-FR"/>
+        </w:rPr>
+        <w:t xml:space="preserve">logintegrite@asce-lc.bf</w:t>
+      </w:r>
+      <w:r>
+        <w:rPr>
+          <w:lang w:val="fr-FR"/>
+        </w:rPr>
+        <w:t xml:space="preserve"> et sur le serveur de messagerie de l’ASCE-LC (</w:t>
+      </w:r>
+      <w:r>
+        <w:rPr>
+          <w:rStyle w:val="VerbatimChar"/>
+          <w:lang w:val="fr-FR"/>
+        </w:rPr>
+        <w:t xml:space="preserve">mailer.gov.bf</w:t>
+      </w:r>
+      <w:r>
+        <w:rPr>
+          <w:lang w:val="fr-FR"/>
+        </w:rPr>
+        <w:t xml:space="preserve">, port 587, STARTTLS, authentification).</w:t>
+      </w:r>
+    </w:p>
+    <w:p>
+      <w:pPr>
+        <w:pStyle w:val="BodyText"/>
+      </w:pPr>
+      <w:r>
+        <w:rPr>
+          <w:lang w:val="fr-FR"/>
+        </w:rPr>
+        <w:t xml:space="preserve">Prérequis : la boîte </w:t>
+      </w:r>
+      <w:r>
+        <w:rPr>
+          <w:rStyle w:val="VerbatimChar"/>
+          <w:lang w:val="fr-FR"/>
+        </w:rPr>
+        <w:t xml:space="preserve">logintegrite@asce-lc.bf</w:t>
+      </w:r>
+      <w:r>
+        <w:rPr>
+          <w:lang w:val="fr-FR"/>
+        </w:rPr>
+        <w:t xml:space="preserve"> existe, quelqu’un la relève, et elle a son propre mot de passe d’envoi. Ne réutilisez pas le compte d’une autre application. Le serveur doit pouvoir joindre le serveur de messagerie ; sinon, demandez l’ouverture du port 587 à l’équipe réseau.</w:t>
       </w:r>
     </w:p>
     <w:p>
@@ -7708,32 +7716,270 @@
           <w:bCs/>
           <w:lang w:val="fr-FR"/>
         </w:rPr>
-        <w:t xml:space="preserve">Résultat attendu</w:t>
-      </w:r>
-      <w:r>
-        <w:rPr>
-          <w:lang w:val="fr-FR"/>
-        </w:rPr>
-        <w:t xml:space="preserve"> </w:t>
-      </w:r>
-      <w:r>
-        <w:rPr>
-          <w:lang w:val="fr-FR"/>
-        </w:rPr>
-        <w:t xml:space="preserve">:</w:t>
-      </w:r>
-      <w:r>
-        <w:rPr>
-          <w:lang w:val="fr-FR"/>
-        </w:rPr>
-        <w:t xml:space="preserve"> </w:t>
-      </w:r>
-      <w:r>
-        <w:rPr>
-          <w:rStyle w:val="VerbatimChar"/>
-          <w:lang w:val="fr-FR"/>
-        </w:rPr>
-        <w:t xml:space="preserve">OK</w:t>
+        <w:t xml:space="preserve">Étape 1 — Contrôler que le serveur de messagerie est joignable [Serveur]</w:t>
+      </w:r>
+    </w:p>
+    <w:p>
+      <w:pPr>
+        <w:pStyle w:val="SourceCode"/>
+      </w:pPr>
+      <w:r>
+        <w:rPr>
+          <w:rStyle w:val="VerbatimChar"/>
+          <w:lang w:val="fr-FR"/>
+        </w:rPr>
+        <w:t xml:space="preserve">timeout 5 bash -c '&lt;/dev/tcp/mailer.gov.bf/587' &amp;&amp; echo "port 587 joignable" || echo "injoignable"</w:t>
+      </w:r>
+    </w:p>
+    <w:p>
+      <w:pPr>
+        <w:pStyle w:val="SourceCode"/>
+      </w:pPr>
+      <w:r>
+        <w:rPr>
+          <w:rStyle w:val="VerbatimChar"/>
+          <w:lang w:val="fr-FR"/>
+        </w:rPr>
+        <w:t xml:space="preserve">getent hosts mailer.gov.bf</w:t>
+      </w:r>
+    </w:p>
+    <w:p>
+      <w:pPr>
+        <w:pStyle w:val="FirstParagraph"/>
+      </w:pPr>
+      <w:r>
+        <w:rPr>
+          <w:b/>
+          <w:bCs/>
+          <w:lang w:val="fr-FR"/>
+        </w:rPr>
+        <w:t xml:space="preserve">Étape 2 — Renseigner .env.prod [Serveur]</w:t>
+      </w:r>
+    </w:p>
+    <w:p>
+      <w:pPr>
+        <w:pStyle w:val="BodyText"/>
+      </w:pPr>
+      <w:r>
+        <w:rPr>
+          <w:lang w:val="fr-FR"/>
+        </w:rPr>
+        <w:t xml:space="preserve">Ajoutez ces lignes à </w:t>
+      </w:r>
+      <w:r>
+        <w:rPr>
+          <w:rStyle w:val="VerbatimChar"/>
+          <w:lang w:val="fr-FR"/>
+        </w:rPr>
+        <w:t xml:space="preserve">~/logintegrite_backend/.env.prod</w:t>
+      </w:r>
+      <w:r>
+        <w:rPr>
+          <w:lang w:val="fr-FR"/>
+        </w:rPr>
+        <w:t xml:space="preserve"> (modèle dans </w:t>
+      </w:r>
+      <w:r>
+        <w:rPr>
+          <w:rStyle w:val="VerbatimChar"/>
+          <w:lang w:val="fr-FR"/>
+        </w:rPr>
+        <w:t xml:space="preserve">.env.prod.example</w:t>
+      </w:r>
+      <w:r>
+        <w:rPr>
+          <w:lang w:val="fr-FR"/>
+        </w:rPr>
+        <w:t xml:space="preserve">). Saisissez le mot de passe directement dans le fichier : ne le collez jamais dans un courriel ou une messagerie.</w:t>
+      </w:r>
+    </w:p>
+    <w:p>
+      <w:pPr>
+        <w:pStyle w:val="SourceCode"/>
+      </w:pPr>
+      <w:r>
+        <w:rPr>
+          <w:rStyle w:val="VerbatimChar"/>
+          <w:lang w:val="fr-FR"/>
+        </w:rPr>
+        <w:t xml:space="preserve">SMTP_HOST=mailer.gov.bf</w:t>
+      </w:r>
+    </w:p>
+    <w:p>
+      <w:pPr>
+        <w:pStyle w:val="SourceCode"/>
+      </w:pPr>
+      <w:r>
+        <w:rPr>
+          <w:rStyle w:val="VerbatimChar"/>
+          <w:lang w:val="fr-FR"/>
+        </w:rPr>
+        <w:t xml:space="preserve">SMTP_PORT=587</w:t>
+      </w:r>
+    </w:p>
+    <w:p>
+      <w:pPr>
+        <w:pStyle w:val="SourceCode"/>
+      </w:pPr>
+      <w:r>
+        <w:rPr>
+          <w:rStyle w:val="VerbatimChar"/>
+          <w:lang w:val="fr-FR"/>
+        </w:rPr>
+        <w:t xml:space="preserve">SMTP_USER=logintegrite@asce-lc.bf</w:t>
+      </w:r>
+    </w:p>
+    <w:p>
+      <w:pPr>
+        <w:pStyle w:val="SourceCode"/>
+      </w:pPr>
+      <w:r>
+        <w:rPr>
+          <w:rStyle w:val="VerbatimChar"/>
+          <w:lang w:val="fr-FR"/>
+        </w:rPr>
+        <w:t xml:space="preserve">SMTP_FROM=logintegrite@asce-lc.bf</w:t>
+      </w:r>
+    </w:p>
+    <w:p>
+      <w:pPr>
+        <w:pStyle w:val="SourceCode"/>
+      </w:pPr>
+      <w:r>
+        <w:rPr>
+          <w:rStyle w:val="VerbatimChar"/>
+          <w:lang w:val="fr-FR"/>
+        </w:rPr>
+        <w:t xml:space="preserve">SMTP_PASSWORD=&lt;mot de passe de la boîte&gt;</w:t>
+      </w:r>
+    </w:p>
+    <w:p>
+      <w:pPr>
+        <w:pStyle w:val="FirstParagraph"/>
+      </w:pPr>
+      <w:r>
+        <w:rPr>
+          <w:b/>
+          <w:bCs/>
+          <w:lang w:val="fr-FR"/>
+        </w:rPr>
+        <w:t xml:space="preserve">Étape 3 — Recréer Keycloak pour qu’il lise ces variables [Serveur]</w:t>
+      </w:r>
+    </w:p>
+    <w:p>
+      <w:pPr>
+        <w:pStyle w:val="SourceCode"/>
+      </w:pPr>
+      <w:r>
+        <w:rPr>
+          <w:rStyle w:val="VerbatimChar"/>
+          <w:lang w:val="fr-FR"/>
+        </w:rPr>
+        <w:t xml:space="preserve">cd ~/logintegrite_backend</w:t>
+      </w:r>
+    </w:p>
+    <w:p>
+      <w:pPr>
+        <w:pStyle w:val="SourceCode"/>
+      </w:pPr>
+      <w:r>
+        <w:rPr>
+          <w:rStyle w:val="VerbatimChar"/>
+          <w:lang w:val="fr-FR"/>
+        </w:rPr>
+        <w:t xml:space="preserve">docker compose -f docker-compose.prod.yml --env-file .env.prod up -d keycloak</w:t>
+      </w:r>
+    </w:p>
+    <w:p>
+      <w:pPr>
+        <w:pStyle w:val="BodyText"/>
+      </w:pPr>
+      <w:r>
+        <w:rPr>
+          <w:lang w:val="fr-FR"/>
+        </w:rPr>
+        <w:t xml:space="preserve">La connexion à l’application est interrompue environ une minute pendant le redémarrage de Keycloak. Attendez que </w:t>
+      </w:r>
+      <w:r>
+        <w:rPr>
+          <w:rStyle w:val="VerbatimChar"/>
+          <w:lang w:val="fr-FR"/>
+        </w:rPr>
+        <w:t xml:space="preserve">lip-keycloak</w:t>
+      </w:r>
+      <w:r>
+        <w:rPr>
+          <w:lang w:val="fr-FR"/>
+        </w:rPr>
+        <w:t xml:space="preserve"> soit de nouveau actif (</w:t>
+      </w:r>
+      <w:r>
+        <w:rPr>
+          <w:rStyle w:val="VerbatimChar"/>
+          <w:lang w:val="fr-FR"/>
+        </w:rPr>
+        <w:t xml:space="preserve">ps</w:t>
+      </w:r>
+      <w:r>
+        <w:rPr>
+          <w:lang w:val="fr-FR"/>
+        </w:rPr>
+        <w:t xml:space="preserve">).</w:t>
+      </w:r>
+    </w:p>
+    <w:p>
+      <w:pPr>
+        <w:pStyle w:val="FirstParagraph"/>
+      </w:pPr>
+      <w:r>
+        <w:rPr>
+          <w:b/>
+          <w:bCs/>
+          <w:lang w:val="fr-FR"/>
+        </w:rPr>
+        <w:t xml:space="preserve">Étape 4 — Appliquer la configuration au realm [Serveur]</w:t>
+      </w:r>
+    </w:p>
+    <w:p>
+      <w:pPr>
+        <w:pStyle w:val="SourceCode"/>
+      </w:pPr>
+      <w:r>
+        <w:rPr>
+          <w:rStyle w:val="VerbatimChar"/>
+          <w:lang w:val="fr-FR"/>
+        </w:rPr>
+        <w:t xml:space="preserve">cd ~/logintegrite_backend</w:t>
+      </w:r>
+    </w:p>
+    <w:p>
+      <w:pPr>
+        <w:pStyle w:val="SourceCode"/>
+      </w:pPr>
+      <w:r>
+        <w:rPr>
+          <w:rStyle w:val="VerbatimChar"/>
+          <w:lang w:val="fr-FR"/>
+        </w:rPr>
+        <w:t xml:space="preserve">scripts/keycloak-smtp.sh appliquer</w:t>
+      </w:r>
+    </w:p>
+    <w:p>
+      <w:pPr>
+        <w:pStyle w:val="BodyText"/>
+      </w:pPr>
+      <w:r>
+        <w:rPr>
+          <w:lang w:val="fr-FR"/>
+        </w:rPr>
+        <w:t xml:space="preserve">Résultat attendu : le message « Messagerie appliquée ». Le mot de passe SMTP est lu dans le conteneur : il n’apparaît ni dans la ligne de commande ni dans l’historique du serveur. Pour contrôler la configuration (le mot de passe est masqué) : </w:t>
+      </w:r>
+      <w:r>
+        <w:rPr>
+          <w:rStyle w:val="VerbatimChar"/>
+          <w:lang w:val="fr-FR"/>
+        </w:rPr>
+        <w:t xml:space="preserve">scripts/keycloak-smtp.sh afficher</w:t>
       </w:r>
       <w:r>
         <w:rPr>
@@ -7742,8 +7988,119 @@
         <w:t xml:space="preserve">.</w:t>
       </w:r>
     </w:p>
-    <w:bookmarkEnd w:id="34"/>
-    <w:bookmarkStart w:id="35" w:name="Xf71e5a08436c20eea3b1080520731113d8fc391"/>
+    <w:p>
+      <w:pPr>
+        <w:pStyle w:val="FirstParagraph"/>
+      </w:pPr>
+      <w:r>
+        <w:rPr>
+          <w:b/>
+          <w:bCs/>
+          <w:lang w:val="fr-FR"/>
+        </w:rPr>
+        <w:t xml:space="preserve">Étape 5 — Tester avec un vrai compte</w:t>
+      </w:r>
+    </w:p>
+    <w:p>
+      <w:pPr>
+        <w:pStyle w:val="BodyText"/>
+      </w:pPr>
+      <w:r>
+        <w:rPr>
+          <w:lang w:val="fr-FR"/>
+        </w:rPr>
+        <w:t xml:space="preserve">Sur la page de connexion, cliquez sur « Mot de passe oublié ? », saisissez l’adresse d’un compte de test dont la boîte est accessible, puis ouvrez le courriel reçu. Le lien est valable 15 minutes ; le nouveau mot de passe doit respecter la politique (12 caractères, une majuscule, une minuscule, un chiffre). Contrôlez l’événement dans le journal des connexions.</w:t>
+      </w:r>
+    </w:p>
+    <w:p>
+      <w:pPr>
+        <w:pStyle w:val="BlockText"/>
+      </w:pPr>
+      <w:r>
+        <w:rPr>
+          <w:b/>
+          <w:bCs/>
+          <w:lang w:val="fr-FR"/>
+        </w:rPr>
+        <w:t xml:space="preserve">Si le courriel n’arrive pas.</w:t>
+      </w:r>
+      <w:r>
+        <w:rPr>
+          <w:lang w:val="fr-FR"/>
+        </w:rPr>
+        <w:t xml:space="preserve"> </w:t>
+      </w:r>
+      <w:r>
+        <w:rPr>
+          <w:lang w:val="fr-FR"/>
+        </w:rPr>
+        <w:t xml:space="preserve">Vérifier dans l’ordre : le dossier « indésirables » ; </w:t>
+      </w:r>
+      <w:r>
+        <w:rPr>
+          <w:rStyle w:val="VerbatimChar"/>
+          <w:lang w:val="fr-FR"/>
+        </w:rPr>
+        <w:t xml:space="preserve">docker compose … logs keycloak | grep -i -E "mail|smtp"</w:t>
+      </w:r>
+      <w:r>
+        <w:rPr>
+          <w:lang w:val="fr-FR"/>
+        </w:rPr>
+        <w:t xml:space="preserve"> ; le port 587 (étape 1) ; le mot de passe de la boîte ; l’autorisation, côté messagerie, d’envoyer avec l’adresse </w:t>
+      </w:r>
+      <w:r>
+        <w:rPr>
+          <w:rStyle w:val="VerbatimChar"/>
+          <w:lang w:val="fr-FR"/>
+        </w:rPr>
+        <w:t xml:space="preserve">logintegrite@asce-lc.bf</w:t>
+      </w:r>
+      <w:r>
+        <w:rPr>
+          <w:lang w:val="fr-FR"/>
+        </w:rPr>
+        <w:t xml:space="preserve">.</w:t>
+      </w:r>
+    </w:p>
+    <w:p>
+      <w:pPr>
+        <w:pStyle w:val="BlockText"/>
+      </w:pPr>
+      <w:r>
+        <w:rPr>
+          <w:b/>
+          <w:bCs/>
+          <w:lang w:val="fr-FR"/>
+        </w:rPr>
+        <w:t xml:space="preserve">Précaution.</w:t>
+      </w:r>
+      <w:r>
+        <w:rPr>
+          <w:lang w:val="fr-FR"/>
+        </w:rPr>
+        <w:t xml:space="preserve"> </w:t>
+      </w:r>
+      <w:r>
+        <w:rPr>
+          <w:lang w:val="fr-FR"/>
+        </w:rPr>
+        <w:t xml:space="preserve">Quiconque contrôle la boîte mail d’un utilisateur peut, avec ce lien, prendre son compte. Cette fonction est un compromis entre la commodité et la sécurité : elle ne dispense pas de bien protéger les boîtes mail, et un compte de consultation expiré reste bloqué même après une réinitialisation. Pour retirer le lien : </w:t>
+      </w:r>
+      <w:r>
+        <w:rPr>
+          <w:rStyle w:val="VerbatimChar"/>
+          <w:lang w:val="fr-FR"/>
+        </w:rPr>
+        <w:t xml:space="preserve">scripts/keycloak-smtp.sh desactiver</w:t>
+      </w:r>
+      <w:r>
+        <w:rPr>
+          <w:lang w:val="fr-FR"/>
+        </w:rPr>
+        <w:t xml:space="preserve">.</w:t>
+      </w:r>
+    </w:p>
     <w:p>
       <w:pPr>
         <w:pStyle w:val="Heading2"/>

</xml_diff>